<commit_message>
docs(policy): record team acceptance gate
</commit_message>
<xml_diff>
--- a/docs/BACKLOG DECISION REVIEW CAA 261026.docx
+++ b/docs/BACKLOG DECISION REVIEW CAA 261026.docx
@@ -10425,6 +10425,16 @@
     <w:p>
       <w:r>
         <w:t>current policy, subject to the instructor floor below.</w:t>
+      </w:r>
+    </w:p>
+    <w:p>
+      <w:r>
+        <w:t>The team confirmed on 26 October 2026 that the PO/delegate acceptance receipt</w:t>
+      </w:r>
+    </w:p>
+    <w:p>
+      <w:r>
+        <w:t>is a team-wide Definition of Done gate, not a PR-specific preference.</w:t>
       </w:r>
     </w:p>
     <w:p>

</xml_diff>